<commit_message>
chore: add requirements.txt, polish technical wording in report and viva docs
</commit_message>
<xml_diff>
--- a/Project_Report.docx
+++ b/Project_Report.docx
@@ -12,7 +12,7 @@
           <w:color w:val="0F172A"/>
           <w:sz w:val="44"/>
         </w:rPr>
-        <w:t>Comprehensive Project Report &amp; Examination Document</w:t>
+        <w:t>Comprehensive Project Report</w:t>
       </w:r>
     </w:p>
     <w:p>
@@ -67,21 +67,6 @@
         <w:rPr>
           <w:b/>
         </w:rPr>
-        <w:t>Evaluation Allocation:</w:t>
-      </w:r>
-      <w:r>
-        <w:t xml:space="preserve"> 20 Marks (Documentation &amp; Project Defense)</w:t>
-      </w:r>
-    </w:p>
-    <w:p>
-      <w:pPr>
-        <w:spacing w:after="80"/>
-      </w:pPr>
-      <w:r/>
-      <w:r>
-        <w:rPr>
-          <w:b/>
-        </w:rPr>
         <w:t>Selected Algorithm:</w:t>
       </w:r>
       <w:r>
@@ -100,7 +85,7 @@
         <w:t>Deployment Platform:</w:t>
       </w:r>
       <w:r>
-        <w:t xml:space="preserve"> Interactive Streamlit Full-Stack Web Application (`localhost:8501`)</w:t>
+        <w:t xml:space="preserve"> Interactive Streamlit Web Application (`localhost:8501`)</w:t>
       </w:r>
     </w:p>
     <w:p>
@@ -129,7 +114,7 @@
         <w:spacing w:after="80"/>
       </w:pPr>
       <w:r>
-        <w:t>This project delivers an end-to-end Machine Learning pipeline and web application designed to predict road traffic accident severity (</w:t>
+        <w:t>This project presents an end-to-end Machine Learning pipeline and web application designed to predict road traffic accident severity (</w:t>
       </w:r>
       <w:r>
         <w:rPr>
@@ -164,13 +149,13 @@
         <w:spacing w:after="80"/>
       </w:pPr>
       <w:r>
-        <w:t>Traffic accidents present severe public health and financial burdens. Transport authorities require automated decision-support tools to identify high-risk intersections and deploy targeted interventions before fatal collisions occur. Because real-world accident data is heavily imbalanced (</w:t>
+        <w:t>Traffic accidents present significant public safety concerns. Transport authorities require automated decision-support tools to identify high-risk conditions and deploy targeted interventions. Because real-world accident data is heavily imbalanced (</w:t>
       </w:r>
       <w:r>
         <w:rPr>
           <w:b/>
         </w:rPr>
-        <w:t>~80% Slight</w:t>
+        <w:t>80.34% Slight</w:t>
       </w:r>
       <w:r>
         <w:t xml:space="preserve">, </w:t>
@@ -179,7 +164,7 @@
         <w:rPr>
           <w:b/>
         </w:rPr>
-        <w:t>~15% Serious</w:t>
+        <w:t>14.66% Serious</w:t>
       </w:r>
       <w:r>
         <w:t xml:space="preserve">, and </w:t>
@@ -188,10 +173,10 @@
         <w:rPr>
           <w:b/>
         </w:rPr>
-        <w:t>~5% Fatal</w:t>
+        <w:t>5.00% Fatal</w:t>
       </w:r>
       <w:r>
-        <w:t>), standard predictive models fail by defaulting to majority-class predictions.</w:t>
+        <w:t>), standard classification models tend to default to majority-class predictions.</w:t>
       </w:r>
     </w:p>
     <w:p>
@@ -199,7 +184,7 @@
         <w:spacing w:after="80"/>
       </w:pPr>
       <w:r>
-        <w:t xml:space="preserve">To solve this, our system incorporates </w:t>
+        <w:t xml:space="preserve">To address class imbalance, our pipeline incorporates </w:t>
       </w:r>
       <w:r>
         <w:rPr>
@@ -226,7 +211,7 @@
         <w:t>5-Fold Stratified Cross-Validation</w:t>
       </w:r>
       <w:r>
-        <w:t>. The final deployed model—</w:t>
+        <w:t>. The selected model—</w:t>
       </w:r>
       <w:r>
         <w:rPr>
@@ -235,7 +220,7 @@
         <w:t>Logistic Regression paired with SMOTE</w:t>
       </w:r>
       <w:r>
-        <w:t xml:space="preserve">—achieves an exceptional </w:t>
+        <w:t xml:space="preserve">—achieves a </w:t>
       </w:r>
       <w:r>
         <w:rPr>
@@ -244,7 +229,7 @@
         <w:t>78.80% Recall for Fatal accidents</w:t>
       </w:r>
       <w:r>
-        <w:t xml:space="preserve"> and </w:t>
+        <w:t xml:space="preserve"> and a </w:t>
       </w:r>
       <w:r>
         <w:rPr>
@@ -253,7 +238,7 @@
         <w:t>73.14% Macro Recall</w:t>
       </w:r>
       <w:r>
-        <w:t xml:space="preserve">, ensuring that high-risk collisions are flagged accurately while reducing Fatal False Negatives to a minimal </w:t>
+        <w:t xml:space="preserve">, reducing False Negatives for the Fatal class to </w:t>
       </w:r>
       <w:r>
         <w:rPr>
@@ -262,7 +247,7 @@
         <w:t>2.0%</w:t>
       </w:r>
       <w:r>
-        <w:t>.</w:t>
+        <w:t xml:space="preserve"> on the holdout test set.</w:t>
       </w:r>
     </w:p>
     <w:p>
@@ -304,7 +289,7 @@
         <w:spacing w:after="80"/>
       </w:pPr>
       <w:r>
-        <w:t>A transport safety authority wants to predict the severity of a road accident using recorded attributes:</w:t>
+        <w:t>A transport safety authority requires a predictive model to estimate accident severity using recorded attributes:</w:t>
       </w:r>
     </w:p>
     <w:p>
@@ -419,7 +404,7 @@
           <w:color w:val="2563EB"/>
           <w:sz w:val="26"/>
         </w:rPr>
-        <w:t>2.2 Objective Checklist (All Examiner Requirements Satisfied)</w:t>
+        <w:t>2.2 Objective Checklist</w:t>
       </w:r>
     </w:p>
     <w:p>
@@ -554,7 +539,7 @@
         <w:t>Confusion Matrix Analysis:</w:t>
       </w:r>
       <w:r>
-        <w:t xml:space="preserve"> Plotted and interpreted holdout test set confusion matrix.</w:t>
+        <w:t xml:space="preserve"> Evaluated holdout test set predictions using a confusion matrix.</w:t>
       </w:r>
     </w:p>
     <w:p>
@@ -572,7 +557,7 @@
         <w:t>Interactive Web Deployment:</w:t>
       </w:r>
       <w:r>
-        <w:t xml:space="preserve"> Developed and deployed a Streamlit dashboard with direct model display and automated action recommendations.</w:t>
+        <w:t xml:space="preserve"> Developed a Streamlit web application displaying the selected model and prediction details.</w:t>
       </w:r>
     </w:p>
     <w:p>
@@ -601,7 +586,7 @@
         <w:spacing w:after="80"/>
       </w:pPr>
       <w:r>
-        <w:t>Because real-world target datasets (e.g., Addis Ababa Road Traffic Accident Dataset) are often restricted or incomplete, a 10,000-sample synthetic dataset was engineered in Python using `numpy` and `pandas`.</w:t>
+        <w:t>Because target historical datasets were unavailable for live deployment, a 10,000-sample synthetic dataset was generated in Python using `numpy` and `pandas`.</w:t>
       </w:r>
     </w:p>
     <w:p>
@@ -614,7 +599,7 @@
           <w:color w:val="2563EB"/>
           <w:sz w:val="26"/>
         </w:rPr>
-        <w:t>3.1 Probability &amp; Physics Correlation Modeling</w:t>
+        <w:t>3.1 Probability Distribution &amp; Correlation Rules</w:t>
       </w:r>
     </w:p>
     <w:p>
@@ -622,7 +607,7 @@
         <w:spacing w:after="80"/>
       </w:pPr>
       <w:r>
-        <w:t>The dataset generator enforces real-world physical laws to create realistic feature interactions:</w:t>
+        <w:t>The dataset generator incorporates predefined probabilistic rules to emulate realistic feature interactions:</w:t>
       </w:r>
     </w:p>
     <w:p>
@@ -638,7 +623,7 @@
         <w:t>Fatal Accidents:</w:t>
       </w:r>
       <w:r>
-        <w:t xml:space="preserve"> Biased toward high speed limits (60–70 mph, $P=0.60$), unlit dark roads ($P=0.60$), freezing/wet road surfaces ($P=0.50$), and night hours ($P=0.50$).</w:t>
+        <w:t xml:space="preserve"> Higher probabilities assigned to high speed limits (60–70 mph), unlit dark roads, freezing/wet road surfaces, and night hours.</w:t>
       </w:r>
     </w:p>
     <w:p>
@@ -654,7 +639,7 @@
         <w:t>Slight Accidents:</w:t>
       </w:r>
       <w:r>
-        <w:t xml:space="preserve"> Biased toward low speed limits (20–30 mph, $P=0.70$), daylight ($P=0.70$), dry roads ($P=0.70$), and cars ($P=0.60$).</w:t>
+        <w:t xml:space="preserve"> Higher probabilities assigned to lower speed limits (20–30 mph), daylight, dry roads, and passenger cars.</w:t>
       </w:r>
     </w:p>
     <w:p>
@@ -667,7 +652,7 @@
           <w:color w:val="2563EB"/>
           <w:sz w:val="26"/>
         </w:rPr>
-        <w:t>3.2 Injected Data Imperfections</w:t>
+        <w:t>3.2 Injected Missing Values</w:t>
       </w:r>
     </w:p>
     <w:p>
@@ -675,7 +660,7 @@
         <w:spacing w:after="80"/>
       </w:pPr>
       <w:r>
-        <w:t>To satisfy real-world preprocessing requirements:</w:t>
+        <w:t>To evaluate missing value handling:</w:t>
       </w:r>
     </w:p>
     <w:p>
@@ -691,7 +676,7 @@
         <w:t>Missing Weather Data:</w:t>
       </w:r>
       <w:r>
-        <w:t xml:space="preserve"> 500 missing values ($5\%$) artificially injected into `Weather_Conditions`.</w:t>
+        <w:t xml:space="preserve"> 500 missing values (5.0%) injected into `Weather_Conditions`.</w:t>
       </w:r>
     </w:p>
     <w:p>
@@ -707,7 +692,7 @@
         <w:t>Missing Surface Data:</w:t>
       </w:r>
       <w:r>
-        <w:t xml:space="preserve"> 500 missing values ($5\%$) artificially injected into `Road_Surface_Conditions`.</w:t>
+        <w:t xml:space="preserve"> 500 missing values (5.0%) injected into `Road_Surface_Conditions`.</w:t>
       </w:r>
     </w:p>
     <w:p>
@@ -794,10 +779,10 @@
         <w:rPr>
           <w:b/>
         </w:rPr>
-        <w:t>Insight:</w:t>
+        <w:t>Observation:</w:t>
       </w:r>
       <w:r>
-        <w:t xml:space="preserve"> `Weather_Conditions` and `Road_Surface_Conditions` each contain 500 missing entries. These are imputed during pipeline execution using mode imputation (`strategy='most_frequent'`).</w:t>
+        <w:t xml:space="preserve"> `Weather_Conditions` and `Road_Surface_Conditions` each contain 500 missing entries. These are handled during pipeline execution using mode imputation (`strategy='most_frequent'`).</w:t>
       </w:r>
     </w:p>
     <w:p>
@@ -952,19 +937,19 @@
         <w:rPr>
           <w:b/>
         </w:rPr>
-        <w:t>Critical Risk:</w:t>
+        <w:t>Analytical Context:</w:t>
       </w:r>
       <w:r>
-        <w:t xml:space="preserve"> A dummy baseline model predicting "Slight" for every row achieves 80.34% accuracy but a </w:t>
+        <w:t xml:space="preserve"> A baseline model predicting "Slight" for every sample achieves 80.34% accuracy but a </w:t>
       </w:r>
       <w:r>
         <w:rPr>
           <w:b/>
         </w:rPr>
-        <w:t>0% Recall for Fatal accidents</w:t>
+        <w:t>0.00% Recall for Fatal accidents</w:t>
       </w:r>
       <w:r>
-        <w:t>, leading to catastrophic failures in safety applications.</w:t>
+        <w:t>.</w:t>
       </w:r>
     </w:p>
     <w:p>
@@ -977,7 +962,7 @@
           <w:color w:val="2563EB"/>
           <w:sz w:val="26"/>
         </w:rPr>
-        <w:t>4.3 Severity vs Light Conditions (Key Risk Visual)</w:t>
+        <w:t>4.3 Severity vs Light Conditions</w:t>
       </w:r>
     </w:p>
     <w:p>
@@ -1030,10 +1015,10 @@
         <w:rPr>
           <w:b/>
         </w:rPr>
-        <w:t>Key Insight:</w:t>
+        <w:t>Observation:</w:t>
       </w:r>
       <w:r>
-        <w:t xml:space="preserve"> Darkness without street illumination (`Darkness - no lighting`) shows the highest proportion of Fatal outcomes (~60% of all fatal crashes occur in unlit zones).</w:t>
+        <w:t xml:space="preserve"> Accidents occurring under `Darkness - no lighting` show a higher proportion of Fatal outcomes compared to illuminated or daylight conditions.</w:t>
       </w:r>
     </w:p>
     <w:p>
@@ -1099,10 +1084,10 @@
         <w:rPr>
           <w:b/>
         </w:rPr>
-        <w:t>Key Insight:</w:t>
+        <w:t>Observation:</w:t>
       </w:r>
       <w:r>
-        <w:t xml:space="preserve"> Fatality occurrences follow an exponential trend as speed increases from 30 mph to 70 mph, confirming kinetic energy principles ($E_k = \frac{1}{2}mv^2$).</w:t>
+        <w:t xml:space="preserve"> Fatality occurrences increase at higher speed limits (50–70 mph). This relationship reflects the synthetic data generation parameters, which were defined to emulate real-world observations where higher speeds correlate with increased collision severity.</w:t>
       </w:r>
     </w:p>
     <w:p>
@@ -1168,10 +1153,10 @@
         <w:rPr>
           <w:b/>
         </w:rPr>
-        <w:t>Key Insight:</w:t>
+        <w:t>Observation:</w:t>
       </w:r>
       <w:r>
-        <w:t xml:space="preserve"> Adverse traction states (Ice, Snow, Flooded roads) drastically escalate minor collisions into serious or fatal emergencies.</w:t>
+        <w:t xml:space="preserve"> Hazardous road conditions (Ice, Snow, Flooded roads) correspond to a higher proportion of Serious and Fatal outcomes compared to dry road surfaces.</w:t>
       </w:r>
     </w:p>
     <w:p>
@@ -1192,7 +1177,7 @@
           <w:color w:val="1E3A8A"/>
           <w:sz w:val="32"/>
         </w:rPr>
-        <w:t>5. Machine Learning Pipeline &amp; Imbalance Preprocessing</w:t>
+        <w:t>5. Machine Learning Pipeline &amp; Preprocessing</w:t>
       </w:r>
     </w:p>
     <w:p>
@@ -1200,7 +1185,7 @@
         <w:spacing w:after="80"/>
       </w:pPr>
       <w:r>
-        <w:t>To ensure zero data leakage between training and validation sets, all transformation steps were encapsulated inside an `ImbPipeline` from `imblearn.pipeline`:</w:t>
+        <w:t>To prevent data leakage, preprocessing steps (Imputation, One-Hot Encoding, and SMOTE) were encapsulated inside an `ImbPipeline` from `imblearn.pipeline`:</w:t>
       </w:r>
     </w:p>
     <w:p>
@@ -1225,13 +1210,13 @@
         <w:br/>
         <w:t xml:space="preserve">       ▼</w:t>
         <w:br/>
-        <w:t>[SMOTE Oversampling] ──► Synthesizes minority samples ONLY on the training folds</w:t>
+        <w:t>[SMOTE Oversampling] ──► Synthesizes minority samples ONLY on training folds</w:t>
         <w:br/>
         <w:t xml:space="preserve">       │</w:t>
         <w:br/>
         <w:t xml:space="preserve">       ▼</w:t>
         <w:br/>
-        <w:t>[Classifier Engine]  ──► Evaluates: Logistic Regression, KNN, Decision Tree, Random Forest, Gradient Boosting</w:t>
+        <w:t>[Classifier Engine]  ──► Evaluated: Logistic Regression, KNN, Decision Tree, Random Forest, Gradient Boosting</w:t>
         <w:br/>
       </w:r>
     </w:p>
@@ -1253,7 +1238,7 @@
         <w:spacing w:after="80"/>
       </w:pPr>
       <w:r>
-        <w:t>SMOTE selects minority samples $x_i$ in feature space, identifies its $k$-nearest neighbors, and generates synthetic samples $x_{new}$ along line segments:</w:t>
+        <w:t>SMOTE selects minority class samples $x_i$ in feature space, identifies their $k$-nearest neighbors, and generates synthetic samples $x_{new}$ along feature vectors:</w:t>
       </w:r>
     </w:p>
     <w:p>
@@ -1262,14 +1247,6 @@
       </w:pPr>
       <w:r>
         <w:t>$$x_{new} = x_i + \lambda (x_{zi} - x_i) \quad \text{where } \lambda \sim U(0,1)$$</w:t>
-      </w:r>
-    </w:p>
-    <w:p>
-      <w:pPr>
-        <w:spacing w:after="80"/>
-      </w:pPr>
-      <w:r>
-        <w:t>This creates smooth decision boundaries rather than duplicating exact rows (which causes overfitting).</w:t>
       </w:r>
     </w:p>
     <w:p>
@@ -1298,7 +1275,7 @@
         <w:spacing w:after="80"/>
       </w:pPr>
       <w:r>
-        <w:t>All models were evaluated across 5 stratified folds. The table below presents the verified mean evaluation metrics across all algorithms:</w:t>
+        <w:t>All models were evaluated using 5-Fold Stratified Cross-Validation. The mean performance metrics across all 5 folds are presented below:</w:t>
       </w:r>
     </w:p>
     <w:tbl>
@@ -2018,7 +1995,7 @@
           <w:color w:val="2563EB"/>
           <w:sz w:val="26"/>
         </w:rPr>
-        <w:t>Why Logistic Regression + SMOTE was Selected over Ensembles</w:t>
+        <w:t>Algorithm Trade-Off Analysis</w:t>
       </w:r>
     </w:p>
     <w:p>
@@ -2032,19 +2009,10 @@
         <w:rPr>
           <w:b/>
         </w:rPr>
-        <w:t>The Safety-Critical Trade-Off:</w:t>
+        <w:t>Accuracy vs. Recall Trade-Off:</w:t>
       </w:r>
       <w:r>
-        <w:t xml:space="preserve"> While Gradient Boosting achieves higher raw accuracy (83.19%), it misses </w:t>
-      </w:r>
-      <w:r>
-        <w:rPr>
-          <w:b/>
-        </w:rPr>
-        <w:t>30.2% of Fatal accidents</w:t>
-      </w:r>
-      <w:r>
-        <w:t xml:space="preserve"> (Fatal Recall of 69.80%).</w:t>
+        <w:t xml:space="preserve"> Gradient Boosting achieved higher overall accuracy (83.19%), but a lower Fatal Recall (69.80%).</w:t>
       </w:r>
     </w:p>
     <w:p>
@@ -2058,7 +2026,7 @@
         <w:rPr>
           <w:b/>
         </w:rPr>
-        <w:t>Maximizing Fatal Recall:</w:t>
+        <w:t>Prioritizing Minority Recall:</w:t>
       </w:r>
       <w:r>
         <w:t xml:space="preserve"> </w:t>
@@ -2070,7 +2038,7 @@
         <w:t>Logistic Regression + SMOTE</w:t>
       </w:r>
       <w:r>
-        <w:t xml:space="preserve"> achieves the highest </w:t>
+        <w:t xml:space="preserve"> was selected because it achieved the highest </w:t>
       </w:r>
       <w:r>
         <w:rPr>
@@ -2102,19 +2070,10 @@
         <w:rPr>
           <w:b/>
         </w:rPr>
-        <w:t>Cost of Errors:</w:t>
+        <w:t>Metric Selection Justification:</w:t>
       </w:r>
       <w:r>
-        <w:t xml:space="preserve"> In road safety, a False Positive (classifying a slight accident as fatal) results in extra safety monitoring, whereas a False Negative (classifying a fatal risk as slight) results in loss of human life. Therefore, </w:t>
-      </w:r>
-      <w:r>
-        <w:rPr>
-          <w:b/>
-        </w:rPr>
-        <w:t>minimizing Fatal False Negatives is the paramount objective</w:t>
-      </w:r>
-      <w:r>
-        <w:t>.</w:t>
+        <w:t xml:space="preserve"> In safety-focused classification tasks, minimizing False Negatives for high-severity classes is prioritized over overall accuracy.</w:t>
       </w:r>
     </w:p>
     <w:p>
@@ -2135,7 +2094,7 @@
           <w:color w:val="1E3A8A"/>
           <w:sz w:val="32"/>
         </w:rPr>
-        <w:t>8. Confusion Matrix Deep Dive</w:t>
+        <w:t>8. Confusion Matrix Analysis</w:t>
       </w:r>
     </w:p>
     <w:p>
@@ -2143,16 +2102,7 @@
         <w:spacing w:after="80"/>
       </w:pPr>
       <w:r>
-        <w:t xml:space="preserve">Evaluated on a holdout test set of </w:t>
-      </w:r>
-      <w:r>
-        <w:rPr>
-          <w:b/>
-        </w:rPr>
-        <w:t>2,000 unseen records (20%)</w:t>
-      </w:r>
-      <w:r>
-        <w:t>:</w:t>
+        <w:t>The selected model was evaluated on a 20% holdout test set (2,000 records):</w:t>
       </w:r>
     </w:p>
     <w:p>
@@ -2225,7 +2175,7 @@
           <w:color w:val="2563EB"/>
           <w:sz w:val="26"/>
         </w:rPr>
-        <w:t>Detailed Class Performance Breakdown</w:t>
+        <w:t>Class Performance Breakdown</w:t>
       </w:r>
     </w:p>
     <w:p>
@@ -2255,7 +2205,7 @@
         <w:t>1,285 (80.0%)</w:t>
       </w:r>
       <w:r>
-        <w:t xml:space="preserve"> correctly identified as </w:t>
+        <w:t xml:space="preserve"> correctly predicted as </w:t>
       </w:r>
       <w:r>
         <w:rPr>
@@ -2280,7 +2230,7 @@
         <w:t>306</w:t>
       </w:r>
       <w:r>
-        <w:t xml:space="preserve"> classified as Serious, </w:t>
+        <w:t xml:space="preserve"> predicted as Serious, </w:t>
       </w:r>
       <w:r>
         <w:rPr>
@@ -2289,7 +2239,7 @@
         <w:t>16</w:t>
       </w:r>
       <w:r>
-        <w:t xml:space="preserve"> as Fatal (preemptive safety escalation).</w:t>
+        <w:t xml:space="preserve"> as Fatal.</w:t>
       </w:r>
     </w:p>
     <w:p>
@@ -2319,7 +2269,7 @@
         <w:t>191 (65.2%)</w:t>
       </w:r>
       <w:r>
-        <w:t xml:space="preserve"> correctly identified as </w:t>
+        <w:t xml:space="preserve"> correctly predicted as </w:t>
       </w:r>
       <w:r>
         <w:rPr>
@@ -2344,7 +2294,7 @@
         <w:t>49</w:t>
       </w:r>
       <w:r>
-        <w:t xml:space="preserve"> escalated to Fatal, </w:t>
+        <w:t xml:space="preserve"> predicted as Fatal, </w:t>
       </w:r>
       <w:r>
         <w:rPr>
@@ -2353,7 +2303,7 @@
         <w:t>53</w:t>
       </w:r>
       <w:r>
-        <w:t xml:space="preserve"> misclassified as Slight.</w:t>
+        <w:t xml:space="preserve"> as Slight.</w:t>
       </w:r>
     </w:p>
     <w:p>
@@ -2383,7 +2333,7 @@
         <w:t>79 (79.0%)</w:t>
       </w:r>
       <w:r>
-        <w:t xml:space="preserve"> correctly identified as </w:t>
+        <w:t xml:space="preserve"> correctly predicted as </w:t>
       </w:r>
       <w:r>
         <w:rPr>
@@ -2408,7 +2358,7 @@
         <w:t>19</w:t>
       </w:r>
       <w:r>
-        <w:t xml:space="preserve"> classified as Serious (borderline severe classification).</w:t>
+        <w:t xml:space="preserve"> predicted as Serious.</w:t>
       </w:r>
     </w:p>
     <w:p>
@@ -2421,35 +2371,10 @@
         <w:rPr>
           <w:b/>
         </w:rPr>
-        <w:t>ONLY 2 out of 100 cases (2.0%)</w:t>
+        <w:t>2 (2.0%)</w:t>
       </w:r>
       <w:r>
-        <w:t xml:space="preserve"> were misclassified as Slight.</w:t>
-      </w:r>
-    </w:p>
-    <w:p>
-      <w:pPr>
-        <w:pStyle w:val="ListBullet"/>
-        <w:spacing w:after="60"/>
-      </w:pPr>
-      <w:r/>
-      <w:r>
-        <w:rPr>
-          <w:b/>
-        </w:rPr>
-        <w:t>Safety Protection Index:</w:t>
-      </w:r>
-      <w:r>
-        <w:t xml:space="preserve"> The system achieves a </w:t>
-      </w:r>
-      <w:r>
-        <w:rPr>
-          <w:b/>
-        </w:rPr>
-        <w:t>98.0% protection rate against severe False Negatives</w:t>
-      </w:r>
-      <w:r>
-        <w:t>.</w:t>
+        <w:t xml:space="preserve"> misclassified as Slight (False Negatives).</w:t>
       </w:r>
     </w:p>
     <w:p>
@@ -2470,7 +2395,7 @@
           <w:color w:val="1E3A8A"/>
           <w:sz w:val="32"/>
         </w:rPr>
-        <w:t>9. Streamlit Full-Stack Application &amp; Localhost Dashboard</w:t>
+        <w:t>9. Web Application Deployment</w:t>
       </w:r>
     </w:p>
     <w:p>
@@ -2478,7 +2403,16 @@
         <w:spacing w:after="80"/>
       </w:pPr>
       <w:r>
-        <w:t>The application is deployed via Streamlit on `localhost:8501`.</w:t>
+        <w:t xml:space="preserve">The model is deployed using </w:t>
+      </w:r>
+      <w:r>
+        <w:rPr>
+          <w:b/>
+        </w:rPr>
+        <w:t>Streamlit</w:t>
+      </w:r>
+      <w:r>
+        <w:t xml:space="preserve"> as an interactive web dashboard (`localhost:8501`).</w:t>
       </w:r>
     </w:p>
     <w:p>
@@ -2491,7 +2425,7 @@
           <w:color w:val="2563EB"/>
           <w:sz w:val="26"/>
         </w:rPr>
-        <w:t>📸 Verified Localhost Application Screenshots</w:t>
+        <w:t>Localhost Application Interface</w:t>
       </w:r>
     </w:p>
     <w:p>
@@ -2547,7 +2481,7 @@
         <w:spacing w:after="80"/>
       </w:pPr>
       <w:r>
-        <w:t>#### 2. Diagnostic Threat Report &amp; Selected Model Badge</w:t>
+        <w:t>#### 2. Diagnostic Threat Report &amp; Selected Model Display</w:t>
       </w:r>
     </w:p>
     <w:p>
@@ -2595,7 +2529,7 @@
         <w:spacing w:after="80"/>
       </w:pPr>
       <w:r>
-        <w:t>#### 3. Live Dataset Exploration Tab</w:t>
+        <w:t>#### 3. Dataset Exploration Tab</w:t>
       </w:r>
     </w:p>
     <w:p>
@@ -2643,7 +2577,7 @@
         <w:spacing w:after="80"/>
       </w:pPr>
       <w:r>
-        <w:t>#### 4. Additional Environmental Risk Visualizations &amp; Confusion Matrix</w:t>
+        <w:t>#### 4. Environmental Risk Visualizations &amp; Confusion Matrix</w:t>
       </w:r>
     </w:p>
     <w:p>
@@ -2691,7 +2625,7 @@
         <w:spacing w:after="80"/>
       </w:pPr>
       <w:r>
-        <w:t>#### 5. Model Intelligence &amp; Rationale Tab</w:t>
+        <w:t>#### 5. Model Intelligence &amp; Methodology Tab</w:t>
       </w:r>
     </w:p>
     <w:p>
@@ -2752,7 +2686,7 @@
           <w:color w:val="1E3A8A"/>
           <w:sz w:val="32"/>
         </w:rPr>
-        <w:t>10. Comprehensive Case Study Questions &amp; Answers</w:t>
+        <w:t>10. Case Study Questions &amp; Answers</w:t>
       </w:r>
     </w:p>
     <w:p>
@@ -2780,7 +2714,7 @@
         <w:t>Answer:</w:t>
       </w:r>
       <w:r>
-        <w:t xml:space="preserve"> Yes. Statistical modeling confirms that environmental factors (lighting, speed limit, road surface, weather) provide strong probabilistic signals for predicting collision severity.</w:t>
+        <w:t xml:space="preserve"> Yes. Statistical classification models demonstrate that environmental attributes (lighting, speed limit, road surface, weather) provide predictive signal for estimating accident severity.</w:t>
       </w:r>
     </w:p>
     <w:p>
@@ -2808,16 +2742,7 @@
         <w:t>Answer:</w:t>
       </w:r>
       <w:r>
-        <w:t xml:space="preserve"> High speed limits (60–70 mph) and </w:t>
-      </w:r>
-      <w:r>
-        <w:rPr>
-          <w:b/>
-        </w:rPr>
-        <w:t>'Darkness - no lighting'</w:t>
-      </w:r>
-      <w:r>
-        <w:t xml:space="preserve"> show the strongest mathematical correlation with Fatal collision occurrences.</w:t>
+        <w:t xml:space="preserve"> Higher speed limits (50–70 mph) and `Darkness - no lighting` show the strongest association with Fatal outcomes in the dataset.</w:t>
       </w:r>
     </w:p>
     <w:p>
@@ -2845,7 +2770,7 @@
         <w:t>Answer:</w:t>
       </w:r>
       <w:r>
-        <w:t xml:space="preserve"> Unmitigated class imbalance causes machine learning algorithms to bias toward the majority class ('Slight'), producing near-zero Fatal Recall and dangerous False Negatives.</w:t>
+        <w:t xml:space="preserve"> Unmitigated class imbalance causes models to optimize overall accuracy by predicting the majority class ('Slight'), resulting in lower recall for rare fatal events.</w:t>
       </w:r>
     </w:p>
     <w:p>
@@ -2913,7 +2838,7 @@
           <w:color w:val="2563EB"/>
           <w:sz w:val="26"/>
         </w:rPr>
-        <w:t>Q5: Which severity categories are most often confused?**</w:t>
+        <w:t>Q5: Which severity categories are most often confused?</w:t>
       </w:r>
     </w:p>
     <w:p>
@@ -2928,7 +2853,7 @@
         <w:t>Answer:</w:t>
       </w:r>
       <w:r>
-        <w:t xml:space="preserve"> 'Slight' and 'Serious' accidents show the highest boundary confusion, primarily because vehicle structural features and occupant seatbelt usage are unobserved variables in environmental reporting.</w:t>
+        <w:t xml:space="preserve"> 'Slight' and 'Serious' categories show the highest degree of boundary overlap, as factors like occupant restraint use or vehicle safety features are not captured in environmental telemetry.</w:t>
       </w:r>
     </w:p>
     <w:p>
@@ -2956,7 +2881,7 @@
         <w:t>Answer:</w:t>
       </w:r>
       <w:r>
-        <w:t xml:space="preserve"> Machine learning models are location-sensitive. Deploying to a new city requires retraining (Transfer Learning) to adapt to local road geometry, speed regulations, and vehicle fleets.</w:t>
+        <w:t xml:space="preserve"> Cross-region performance was not directly evaluated because the project uses a synthetic dataset. Deployment to another region would require validation and retraining using representative local accident data from that jurisdiction.</w:t>
       </w:r>
     </w:p>
     <w:p>
@@ -2984,7 +2909,7 @@
         <w:t>Answer:</w:t>
       </w:r>
       <w:r>
-        <w:t xml:space="preserve"> Yes. Urban planners can input proposed road geometries (e.g., unlit 60mph rural corridors) into the Streamlit app to flag high fatality risks prior to road construction.</w:t>
+        <w:t xml:space="preserve"> Yes. Transport authorities can input proposed road configurations (e.g., speed limits, illumination levels) into the web application to assess predicted risk levels prior to infrastructure changes.</w:t>
       </w:r>
     </w:p>
     <w:p>
@@ -3012,107 +2937,7 @@
         <w:t>Answer:</w:t>
       </w:r>
       <w:r>
-        <w:t xml:space="preserve"> Environmental features do not capture driver fatigue, intoxication, distraction, or vehicle structural crashworthiness. The model predicts environmental risk probability, not deterministic certainty.</w:t>
-      </w:r>
-    </w:p>
-    <w:p>
-      <w:pPr>
-        <w:spacing w:after="80"/>
-      </w:pPr>
-      <w:r>
-        <w:t>---</w:t>
-      </w:r>
-    </w:p>
-    <w:p>
-      <w:pPr>
-        <w:spacing w:before="320" w:after="120"/>
-      </w:pPr>
-      <w:r>
-        <w:rPr>
-          <w:b/>
-          <w:color w:val="1E3A8A"/>
-          <w:sz w:val="32"/>
-        </w:rPr>
-        <w:t>11. Backend &amp; Server Architecture Explanation</w:t>
-      </w:r>
-    </w:p>
-    <w:p>
-      <w:pPr>
-        <w:spacing w:after="80"/>
-      </w:pPr>
-      <w:r/>
-      <w:r>
-        <w:rPr>
-          <w:b/>
-        </w:rPr>
-        <w:t>Question: Do we need a separate Backend framework (Node.js/Express/FastAPI)?</w:t>
-      </w:r>
-      <w:r/>
-    </w:p>
-    <w:p>
-      <w:pPr>
-        <w:spacing w:after="80"/>
-      </w:pPr>
-      <w:r/>
-      <w:r>
-        <w:rPr>
-          <w:b/>
-        </w:rPr>
-        <w:t>Answer: No.</w:t>
-      </w:r>
-      <w:r>
-        <w:t xml:space="preserve"> Streamlit operates as a unified full-stack Python server architecture:</w:t>
-      </w:r>
-    </w:p>
-    <w:p>
-      <w:pPr>
-        <w:spacing w:after="80"/>
-      </w:pPr>
-      <w:r>
-        <w:t xml:space="preserve">1. </w:t>
-      </w:r>
-      <w:r>
-        <w:rPr>
-          <w:b/>
-        </w:rPr>
-        <w:t>Frontend:</w:t>
-      </w:r>
-      <w:r>
-        <w:t xml:space="preserve"> Client-side UI rendered dynamically using HTML5/React bindings.</w:t>
-      </w:r>
-    </w:p>
-    <w:p>
-      <w:pPr>
-        <w:spacing w:after="80"/>
-      </w:pPr>
-      <w:r>
-        <w:t xml:space="preserve">2. </w:t>
-      </w:r>
-      <w:r>
-        <w:rPr>
-          <w:b/>
-        </w:rPr>
-        <w:t>Backend Engine:</w:t>
-      </w:r>
-      <w:r>
-        <w:t xml:space="preserve"> Python process running on `localhost:8501`.</w:t>
-      </w:r>
-    </w:p>
-    <w:p>
-      <w:pPr>
-        <w:spacing w:after="80"/>
-      </w:pPr>
-      <w:r>
-        <w:t xml:space="preserve">3. </w:t>
-      </w:r>
-      <w:r>
-        <w:rPr>
-          <w:b/>
-        </w:rPr>
-        <w:t>ML Pipeline Execution:</w:t>
-      </w:r>
-      <w:r>
-        <w:t xml:space="preserve"> Loads `models/best_model.pkl` into memory via `joblib`, executing real-time vector inference without network overhead or third-party APIs.</w:t>
+        <w:t xml:space="preserve"> Environmental attributes do not capture driver behavioral factors (distraction, intoxication, reaction speed) or vehicle crashworthiness. The model provides an environmental risk estimate rather than a deterministic outcome.</w:t>
       </w:r>
     </w:p>
     <w:sectPr>

</xml_diff>